<commit_message>
fix: publish canonical party bindings and protect original external content
</commit_message>
<xml_diff>
--- a/templates/common-paper-cc-by-4.0/common-paper-ai-addendum/template.docx
+++ b/templates/common-paper-cc-by-4.0/common-paper-ai-addendum/template.docx
@@ -2033,7 +2033,7 @@
                 <w:highlight w:val="yellow"/>
                 <w:rtl w:val="0"/>
               </w:rPr>
-              <w:t xml:space="preserve">{company_name}</w:t>
+              <w:t xml:space="preserve">{provider_signatory_company}</w:t>
             </w:r>
           </w:p>
         </w:tc>
@@ -2102,7 +2102,7 @@
                 <w:highlight w:val="yellow"/>
                 <w:rtl w:val="0"/>
               </w:rPr>
-              <w:t xml:space="preserve">{company_name}</w:t>
+              <w:t xml:space="preserve">{customer_signatory_company}</w:t>
             </w:r>
           </w:p>
         </w:tc>

</xml_diff>

<commit_message>
Publish corrected Common Paper and SAFE definitions in 0.10.2 (#833)
* fix: publish canonical party bindings and protect original external content

* test: verify blocking integrity workflow and unusual filenames

* chore: release corrected template definitions as 0.10.2
</commit_message>
<xml_diff>
--- a/templates/common-paper-cc-by-4.0/common-paper-ai-addendum/template.docx
+++ b/templates/common-paper-cc-by-4.0/common-paper-ai-addendum/template.docx
@@ -2033,7 +2033,7 @@
                 <w:highlight w:val="yellow"/>
                 <w:rtl w:val="0"/>
               </w:rPr>
-              <w:t xml:space="preserve">{company_name}</w:t>
+              <w:t xml:space="preserve">{provider_signatory_company}</w:t>
             </w:r>
           </w:p>
         </w:tc>
@@ -2102,7 +2102,7 @@
                 <w:highlight w:val="yellow"/>
                 <w:rtl w:val="0"/>
               </w:rPr>
-              <w:t xml:space="preserve">{company_name}</w:t>
+              <w:t xml:space="preserve">{customer_signatory_company}</w:t>
             </w:r>
           </w:p>
         </w:tc>

</xml_diff>